<commit_message>
Load a coherent release on Streamlit reruns
Load the complete core source snapshot under a content-derived package name so retained earlier modules cannot supply an outdated agent API. Compile captured source directly, isolate existing module references, and include the release fingerprint in bounded Streamlit caches. Hide legacy briefs that lack a context fingerprint.

Include the loader in source downloads and update the final guide. Validation: 60 automated tests and eight local Chromium checks with the previous agent deliberately kept cached. Hosted rebuild remains unverified.
</commit_message>
<xml_diff>
--- a/docs/Boundary_Project_Guide.docx
+++ b/docs/Boundary_Project_Guide.docx
@@ -12,7 +12,7 @@
     </w:p>
     <w:p>
       <w:r>
-        <w:t>Version 3.0.0 · 18 October 2026</w:t>
+        <w:t>Version 3.0.1 · 18 October 2026</w:t>
       </w:r>
     </w:p>
     <w:p>
@@ -950,7 +950,7 @@
     </w:p>
     <w:p>
       <w:r>
-        <w:t>app.py contains the Streamlit pages, controls and display flow. It imports the boundary_core package explicitly so similarly named installed packages cannot replace the project's modules.</w:t>
+        <w:t>app.py contains the Streamlit pages, controls and display flow. boundary_runtime.py loads the complete boundary_core source snapshot under its own fingerprinted package name. Identical code is reused on reruns. Changed code and its Streamlit cache keys receive a new release fingerprint. Each loaded module resolves its data and assets relative to the project folder.</w:t>
       </w:r>
     </w:p>
     <w:p>
@@ -1009,7 +1009,7 @@
       <w:pStyle w:val="Footer"/>
     </w:pPr>
     <w:r>
-      <w:t>Boundary 3.0.0 | Independent educational project</w:t>
+      <w:t>Boundary 3.0.1 | Independent educational project</w:t>
     </w:r>
   </w:p>
 </w:ftr>

</xml_diff>

<commit_message>
Clarify player totals, enforce research scope and publish source-linked accuracy audit
Default dossiers to labeled archive overviews; disambiguate identical names; validate competition, discipline, phase, season, matchup, franchise and exclusions before preparing briefs. Apply selected dated 2026 availability blocks without fabricating missing replacement metadata.

Include reproducible all-player/archive and all-team checks, primary-source checkpoints with retained gaps/conflict, downloadable audit, and updated plain-English guides. Validated with 68 automated tests, 57 local Chromium checks, 257 dossier cases and complete supplied-archive reconciliation. Hosted rebuild and live provider remain unverified.
</commit_message>
<xml_diff>
--- a/docs/Boundary_Project_Guide.docx
+++ b/docs/Boundary_Project_Guide.docx
@@ -12,7 +12,7 @@
     </w:p>
     <w:p>
       <w:r>
-        <w:t>Version 3.0.1 · 18 October 2026</w:t>
+        <w:t>Version 3.0.2 · 18 October 2026</w:t>
       </w:r>
     </w:p>
     <w:p>
@@ -348,7 +348,7 @@
     </w:tbl>
     <w:p>
       <w:r>
-        <w:t>There are 6,392 included matches and 141,377 player-match records. Yes, there is 2026 evidence. This does not mean every 2026 match is present, or that the app updates itself. SMAT ends in 2024. Check the selected date and the last relevant match for each player.</w:t>
+        <w:t>There are 6,392 included matches and 141,377 player-match records. Yes, there is 2026 evidence. This does not mean every 2026 match is present, or that the app updates itself. SMAT ends in 2024. Check the selected date and the last relevant match for each player. Known coverage gaps affect full career totals. For example, the archive has 3,963 T20I runs for Virat Kohli, while the ICC records 4,188. The SMAT 2024/25 sample has only eight matches. Use archive totals as the supplied sample, not an official complete career record. Evaluation &amp; sources contains the detailed accuracy audit and source-linked comparison download.</w:t>
       </w:r>
     </w:p>
     <w:p>
@@ -358,7 +358,7 @@
     </w:p>
     <w:p>
       <w:r>
-        <w:t>The squad file is a supplied 2026 snapshot with a small set of sourced, dated trade events. It has not been fully reverified against every current registration, replacement, injury or overseas availability. Earlier historical squads cannot be reconstructed from this snapshot. The app refuses to use it for a pre-2026 XI.</w:t>
+        <w:t>The squad file is a supplied 2026 research pool. It can include a withdrawn player and a replacement together. Dated trades and fourteen selected availability notices are applied. Documented outgoing players are blocked after the notice date, even when a capability assumption is supplied. Existing replacements are blocked before their documented join date. Seven documented replacements are missing verified roster metadata; the app names them rather than inventing it. This is partial verification, not a complete current registration list. XI scenarios require a cutoff within 2026. Other seasons need their own verified roster.</w:t>
       </w:r>
     </w:p>
     <w:p>
@@ -555,7 +555,7 @@
     </w:p>
     <w:p>
       <w:r>
-        <w:t>Decision desk prepares a checked brief for one of the four tasks. Confirm a player or comparison identity where needed. The free-text question adds purpose; the structured controls define the calculation. Requests for a different phase, player or budget need matching controls. The app does not silently invent missing age, handedness or current price evidence.</w:t>
+        <w:t>Decision desk prepares a checked brief for one of the four tasks. Confirm a player or comparison identity where needed. The free-text question adds purpose; the structured controls define the calculation. Requests for a different competition, discipline, phase, player, season, franchise, matchup or budget need matching controls. Named exclusions must be confirmed. Complete official career claims need a verified complete source; use Player overview for the supplied archive. A question asking for two phases needs separate scoped briefs. Unknown identity searches cannot produce an unrelated broad result. The app does not silently invent missing age, handedness or current price evidence.</w:t>
       </w:r>
     </w:p>
     <w:p>
@@ -570,7 +570,12 @@
     </w:p>
     <w:p>
       <w:r>
-        <w:t>Player dossier requires identity confirmation, then shows the same scoped totals, seasons, match evidence and observed-rate interval. Two players with similar names are not merged. Historical auction lookup stays manual.</w:t>
+        <w:t>Player dossier starts with Player overview: choose a competition and inspect all supplied phases from its earliest date to before the cutoff. Runs in archive means exactly that sample. Use active research filters switches to the selected research phase and dates. It shows both phase runs and all-phase runs for the same window. The minimum-ball threshold applies to scouting, not dossier visibility. Discipline selects the uncertainty measure; both batting and bowling totals still use the chosen phase. Identical names need an explicit registry choice, with observed teams shown to help. A name such as Rohit Sharma can identify several different people. Historical auction lookup stays manual.</w:t>
+      </w:r>
+    </w:p>
+    <w:p>
+      <w:r>
+        <w:t>Example: Virat Kohli has 114 IPL Death-phase runs in the 2023-10-18 to before 2026-10-18 window, compared with 2,073 all-phase runs in that same window. The complete supplied IPL overview contains 9,336 runs through 2026-05-31. These are different scopes; do not compare a phase sample with a full career total.</w:t>
       </w:r>
     </w:p>
     <w:p>
@@ -585,7 +590,7 @@
     </w:p>
     <w:p>
       <w:r>
-        <w:t>Evaluation &amp; sources contains current release checks, a rolling historical scouting study, twenty unrated team review tasks, a private review form, data/asset sources and SWOT. A submitted rating is feedback, not proof of professional validation.</w:t>
+        <w:t>Evaluation &amp; sources contains the downloadable accuracy audit, official-source numeric checkpoints, current release checks, a rolling historical scouting study, twenty unrated team review tasks, a private review form, data/asset sources and SWOT. A submitted rating is feedback, not proof of professional validation.</w:t>
       </w:r>
     </w:p>
     <w:p>
@@ -856,7 +861,7 @@
     </w:p>
     <w:p>
       <w:r>
-        <w:t>The player registry, supplied squad file, dated squad events and reference attack types are release inputs too. Preserve their sources and review any changes; rebuilding match aggregates alone does not verify current squads.</w:t>
+        <w:t>The player registry, supplied squad file, dated squad events, roster_status.json availability notices and reference attack types are release inputs too. Preserve their sources and review any changes; rebuilding match aggregates alone does not verify current squads.</w:t>
       </w:r>
     </w:p>
     <w:p>
@@ -875,6 +880,16 @@
     <w:p>
       <w:r>
         <w:t>Run python -m unittest discover -s tests -v from the project root. The tests exercise data conventions, identity lookup, supported schedules, scoped task behaviour, model-output rejection, private storage, downloads, startup and the Streamlit interface. Provider fixtures are simulated; they do not spend money or measure live model quality.</w:t>
+      </w:r>
+    </w:p>
+    <w:p>
+      <w:r>
+        <w:t>Run python tools/compare_official_checkpoints.py --output work/accuracy-audit to recalculate the stored numeric checkpoints against the archive. Official values in that script were transcribed from the linked pages on 18 October 2026; this command does not fetch live records.</w:t>
+      </w:r>
+    </w:p>
+    <w:p>
+      <w:r>
+        <w:t>The accuracy audit distinguishes complete raw-archive reconciliation from sampled official-source validation. Its comparison CSV keeps coverage gaps and conflicting values visible. A full per-player official certification still requires complete official scorecards and an independently reviewed registry.</w:t>
       </w:r>
     </w:p>
     <w:p>
@@ -1009,7 +1024,7 @@
       <w:pStyle w:val="Footer"/>
     </w:pPr>
     <w:r>
-      <w:t>Boundary 3.0.1 | Independent educational project</w:t>
+      <w:t>Boundary 3.0.2 | Independent educational project</w:t>
     </w:r>
   </w:p>
 </w:ftr>

</xml_diff>